<commit_message>
Terminology: Stage-1 'residents interviewed' -> 'residents surveyed'
Avoids confusion with the corrected Appendix C interview record; the
Stage-1 instrument was a staff-administered survey.

Co-Authored-By: Claude Fable 5 <noreply@anthropic.com>
Claude-Session: https://claude.ai/code/session_01KoT3i8geZspYBMMKVYJUTG
</commit_message>
<xml_diff>
--- a/docs/thesis/Full_version_V28_EngD_Thesis_Submission_Draft.docx
+++ b/docs/thesis/Full_version_V28_EngD_Thesis_Submission_Draft.docx
@@ -204,7 +204,7 @@
         <w:jc w:val="both"/>
       </w:pPr>
       <w:r>
-        <w:t>Stage 1, a survey of 200 residents interviewed from a population of 280 at a Guangzhou care facility, found the retrospective signal: most prior FRA users reported an adverse first experience and never returned. Stage 2 tested the hypothesis prospectively with thirty residents using an AI-assisted skiing game whose weight-shift control doubles as the clinical measurement. Despite a design satisfying every acceptance and gamification criterion, seventy per cent of participants disengaged at or before three game cycles, none re-engaged, and abandonment persisted even where recorded balance scores improved. Stage 3, the attribution experiment, offered the same game to a separate cohort of 120 Hong Kong adults with the clinical attachment removed: the decoupled game was accepted at the levels the gamification literature predicts — 93.3% retention, and 65.2% of initial dropouts returning voluntarily — a pattern consistent with the coupling account and inconsistent with the dispositional account.</w:t>
+        <w:t>Stage 1, a survey of 200 residents surveyed from a population of 280 at a Guangzhou care facility, found the retrospective signal: most prior FRA users reported an adverse first experience and never returned. Stage 2 tested the hypothesis prospectively with thirty residents using an AI-assisted skiing game whose weight-shift control doubles as the clinical measurement. Despite a design satisfying every acceptance and gamification criterion, seventy per cent of participants disengaged at or before three game cycles, none re-engaged, and abandonment persisted even where recorded balance scores improved. Stage 3, the attribution experiment, offered the same game to a separate cohort of 120 Hong Kong adults with the clinical attachment removed: the decoupled game was accepted at the levels the gamification literature predicts — 93.3% retention, and 65.2% of initial dropouts returning voluntarily — a pattern consistent with the coupling account and inconsistent with the dispositional account.</w:t>
       </w:r>
     </w:p>
     <w:p>
@@ -5894,23 +5894,8 @@
           <w:lang w:val="en-HK" w:eastAsia="zh-CN"/>
           <w:sz w:val="24"/>
         </w:rPr>
-        <w:t>Table 4.1. Stage-1 survey results (N = 200 residents interviewed, of a resident population of 280).</w:t>
-      </w:r>
-      <w:r>
-        <w:rPr>
-          <w:rFonts w:asciiTheme="minorHAnsi" w:hAnsiTheme="minorHAnsi"/>
-          <w:szCs w:val="24"/>
-          <w:lang w:val="en-HK" w:eastAsia="zh-CN"/>
-        </w:rPr>
+        <w:t>Table 4.1. Stage-1 survey results (N = 200 residents surveyed, of a resident population of 280).</w:t>
         <w:tab/>
-      </w:r>
-      <w:r>
-        <w:rPr>
-          <w:rFonts w:asciiTheme="minorHAnsi" w:hAnsiTheme="minorHAnsi" w:ascii="Times New Roman" w:hAnsi="Times New Roman" w:eastAsia="Times New Roman" w:cs="Times New Roman"/>
-          <w:szCs w:val="24"/>
-          <w:lang w:val="en-HK" w:eastAsia="zh-CN"/>
-          <w:sz w:val="24"/>
-        </w:rPr>
         <w:t>31</w:t>
       </w:r>
     </w:p>
@@ -11146,7 +11131,7 @@
           <w:i/>
           <w:b/>
         </w:rPr>
-        <w:t>Table 4.1. Stage-1 survey results (N = 200 residents interviewed, of a resident population of 280).</w:t>
+        <w:t>Table 4.1. Stage-1 survey results (N = 200 residents surveyed, of a resident population of 280).</w:t>
       </w:r>
       <w:bookmarkEnd w:id="57"/>
     </w:p>

</xml_diff>